<commit_message>
docs: update reports with live repository link
</commit_message>
<xml_diff>
--- a/docs/reports/推甄專用_邊緣運算專題實作報告.docx
+++ b/docs/reports/推甄專用_邊緣運算專題實作報告.docx
@@ -2178,9 +2178,32 @@
           <w:color w:val="000000"/>
           <w:sz w:val="24"/>
         </w:rPr>
-        <w:t>• 專案 GitHub 倉庫（含 Arduino 雙緩衝韌體原始碼、EON 編譯函式庫與設定檔）：已開源收錄於個人專案集。</w:t>
+        <w:t>• 專案 GitHub 倉庫（含 Arduino 雙緩衝韌體原始碼、EON 編譯函式庫、高解析架構圖與測試展示）：</w:t>
         <w:br/>
-        <w:t>• 實機聲學驗證展示影片（包含本人控制與他人阻斷測試影片 me_test1~2, others_go/stop）：已發布於雲端儲存空間。</w:t>
+        <w:t xml:space="preserve">  </w:t>
+      </w:r>
+      <w:r>
+        <w:rPr>
+          <w:rFonts w:ascii="Times New Roman" w:hAnsi="Times New Roman" w:cs="Times New Roman" w:eastAsia="標楷體"/>
+          <w:b/>
+          <w:i w:val="0"/>
+          <w:color w:val="1B365D"/>
+          <w:sz w:val="24"/>
+        </w:rPr>
+        <w:t>https://github.com/blackbigg/tinyml-speaker-recognition</w:t>
+        <w:br/>
+      </w:r>
+      <w:r>
+        <w:rPr>
+          <w:rFonts w:ascii="Times New Roman" w:hAnsi="Times New Roman" w:cs="Times New Roman" w:eastAsia="標楷體"/>
+          <w:b w:val="0"/>
+          <w:i w:val="0"/>
+          <w:color w:val="000000"/>
+          <w:sz w:val="24"/>
+        </w:rPr>
+        <w:t>• 實機聲學驗證展示影片（包含本人聲紋控制與他人冒用即時攔截展示）：</w:t>
+        <w:br/>
+        <w:t xml:space="preserve">  收錄於 GitHub 倉庫 demo_videos/ 目錄（me_test1~2.mp4, others_go/stop.mp4）。</w:t>
         <w:br/>
         <w:t>（註：依審查規格精簡要求，原始碼全文不再於書面報告贅列，可直接透過線上儲存庫進行代碼檢核）。</w:t>
       </w:r>

</xml_diff>